<commit_message>
TS 4.7 Jatai Ghanam Tamil and Articles Final for 31st Oct
</commit_message>
<xml_diff>
--- a/TS Jatai Ghanam Project/TS 4.7/TS 4.7 Jatai Tamil Corrections.docx
+++ b/TS Jatai Ghanam Project/TS 4.7/TS 4.7 Jatai Tamil Corrections.docx
@@ -82,17 +82,7 @@
           <w:szCs w:val="32"/>
           <w:u w:val="single"/>
         </w:rPr>
-        <w:t xml:space="preserve"> </w:t>
-      </w:r>
-      <w:r>
-        <w:rPr>
-          <w:b/>
-          <w:bCs/>
-          <w:sz w:val="32"/>
-          <w:szCs w:val="32"/>
-          <w:u w:val="single"/>
-        </w:rPr>
-        <w:t xml:space="preserve">Corrections – Observed till </w:t>
+        <w:t xml:space="preserve"> Corrections – Observed till </w:t>
       </w:r>
       <w:r>
         <w:rPr>
@@ -227,8 +217,64 @@
                 <w:color w:val="000000"/>
                 <w:szCs w:val="40"/>
               </w:rPr>
-              <w:t>NONE   NONE   NONE    NONE</w:t>
-            </w:r>
+              <w:t xml:space="preserve">NONE   </w:t>
+            </w:r>
+            <w:proofErr w:type="spellStart"/>
+            <w:r>
+              <w:rPr>
+                <w:rFonts w:cs="BRH Malayalam Extra"/>
+                <w:b/>
+                <w:bCs/>
+                <w:color w:val="000000"/>
+                <w:szCs w:val="40"/>
+              </w:rPr>
+              <w:t>NONE</w:t>
+            </w:r>
+            <w:proofErr w:type="spellEnd"/>
+            <w:r>
+              <w:rPr>
+                <w:rFonts w:cs="BRH Malayalam Extra"/>
+                <w:b/>
+                <w:bCs/>
+                <w:color w:val="000000"/>
+                <w:szCs w:val="40"/>
+              </w:rPr>
+              <w:t xml:space="preserve">   </w:t>
+            </w:r>
+            <w:proofErr w:type="spellStart"/>
+            <w:r>
+              <w:rPr>
+                <w:rFonts w:cs="BRH Malayalam Extra"/>
+                <w:b/>
+                <w:bCs/>
+                <w:color w:val="000000"/>
+                <w:szCs w:val="40"/>
+              </w:rPr>
+              <w:t>NONE</w:t>
+            </w:r>
+            <w:proofErr w:type="spellEnd"/>
+            <w:r>
+              <w:rPr>
+                <w:rFonts w:cs="BRH Malayalam Extra"/>
+                <w:b/>
+                <w:bCs/>
+                <w:color w:val="000000"/>
+                <w:szCs w:val="40"/>
+              </w:rPr>
+              <w:t xml:space="preserve">    </w:t>
+            </w:r>
+            <w:proofErr w:type="spellStart"/>
+            <w:r>
+              <w:rPr>
+                <w:rFonts w:cs="BRH Malayalam Extra"/>
+                <w:b/>
+                <w:bCs/>
+                <w:color w:val="000000"/>
+                <w:szCs w:val="40"/>
+              </w:rPr>
+              <w:t>NONE</w:t>
+            </w:r>
+            <w:proofErr w:type="spellEnd"/>
           </w:p>
         </w:tc>
         <w:tc>
@@ -257,8 +303,64 @@
                 <w:color w:val="000000"/>
                 <w:szCs w:val="40"/>
               </w:rPr>
-              <w:t>NONE   NONE   NONE    NONE</w:t>
-            </w:r>
+              <w:t xml:space="preserve">NONE   </w:t>
+            </w:r>
+            <w:proofErr w:type="spellStart"/>
+            <w:r>
+              <w:rPr>
+                <w:rFonts w:cs="BRH Malayalam Extra"/>
+                <w:b/>
+                <w:bCs/>
+                <w:color w:val="000000"/>
+                <w:szCs w:val="40"/>
+              </w:rPr>
+              <w:t>NONE</w:t>
+            </w:r>
+            <w:proofErr w:type="spellEnd"/>
+            <w:r>
+              <w:rPr>
+                <w:rFonts w:cs="BRH Malayalam Extra"/>
+                <w:b/>
+                <w:bCs/>
+                <w:color w:val="000000"/>
+                <w:szCs w:val="40"/>
+              </w:rPr>
+              <w:t xml:space="preserve">   </w:t>
+            </w:r>
+            <w:proofErr w:type="spellStart"/>
+            <w:r>
+              <w:rPr>
+                <w:rFonts w:cs="BRH Malayalam Extra"/>
+                <w:b/>
+                <w:bCs/>
+                <w:color w:val="000000"/>
+                <w:szCs w:val="40"/>
+              </w:rPr>
+              <w:t>NONE</w:t>
+            </w:r>
+            <w:proofErr w:type="spellEnd"/>
+            <w:r>
+              <w:rPr>
+                <w:rFonts w:cs="BRH Malayalam Extra"/>
+                <w:b/>
+                <w:bCs/>
+                <w:color w:val="000000"/>
+                <w:szCs w:val="40"/>
+              </w:rPr>
+              <w:t xml:space="preserve">    </w:t>
+            </w:r>
+            <w:proofErr w:type="spellStart"/>
+            <w:r>
+              <w:rPr>
+                <w:rFonts w:cs="BRH Malayalam Extra"/>
+                <w:b/>
+                <w:bCs/>
+                <w:color w:val="000000"/>
+                <w:szCs w:val="40"/>
+              </w:rPr>
+              <w:t>NONE</w:t>
+            </w:r>
+            <w:proofErr w:type="spellEnd"/>
           </w:p>
         </w:tc>
       </w:tr>
@@ -285,19 +387,6 @@
         </w:rPr>
         <w:t>===============</w:t>
       </w:r>
-    </w:p>
-    <w:p>
-      <w:pPr>
-        <w:spacing w:before="0" w:line="240" w:lineRule="auto"/>
-        <w:jc w:val="center"/>
-        <w:rPr>
-          <w:b/>
-          <w:bCs/>
-          <w:sz w:val="32"/>
-          <w:szCs w:val="32"/>
-          <w:u w:val="single"/>
-        </w:rPr>
-      </w:pPr>
     </w:p>
     <w:p>
       <w:pPr>
@@ -6179,6 +6268,9 @@
     </w:tbl>
     <w:p>
       <w:pPr>
+        <w:pBdr>
+          <w:bottom w:val="double" w:sz="6" w:space="1" w:color="auto"/>
+        </w:pBdr>
         <w:spacing w:before="0" w:line="240" w:lineRule="auto"/>
         <w:jc w:val="center"/>
         <w:rPr>
@@ -6190,7 +6282,11 @@
           <w:lang w:val="en-IN"/>
         </w:rPr>
       </w:pPr>
-      <w:r>
+    </w:p>
+    <w:p>
+      <w:pPr>
+        <w:spacing w:before="0" w:line="240" w:lineRule="auto"/>
+        <w:jc w:val="center"/>
         <w:rPr>
           <w:b/>
           <w:bCs/>
@@ -6199,8 +6295,7 @@
           <w:u w:val="single"/>
           <w:lang w:val="en-IN"/>
         </w:rPr>
-        <w:t>==============</w:t>
-      </w:r>
+      </w:pPr>
     </w:p>
     <w:p>
       <w:pPr>
@@ -7515,6 +7610,7 @@
                 <w:cs/>
                 <w:lang w:bidi="ta-IN"/>
               </w:rPr>
+              <w:lastRenderedPageBreak/>
               <w:t>31</w:t>
             </w:r>
             <w:r>
@@ -8449,7 +8545,6 @@
                 <w:cs/>
                 <w:lang w:bidi="ta-IN"/>
               </w:rPr>
-              <w:lastRenderedPageBreak/>
               <w:t>49</w:t>
             </w:r>
             <w:r>
@@ -12569,6 +12664,7 @@
                 <w:cs/>
                 <w:lang w:bidi="ta-IN"/>
               </w:rPr>
+              <w:lastRenderedPageBreak/>
               <w:t>27</w:t>
             </w:r>
             <w:r>
@@ -12876,7 +12972,6 @@
                 <w:cs/>
                 <w:lang w:bidi="ta-IN"/>
               </w:rPr>
-              <w:lastRenderedPageBreak/>
               <w:t>அ</w:t>
             </w:r>
             <w:r>
@@ -13250,7 +13345,6 @@
                 <w:cs/>
                 <w:lang w:bidi="ta-IN"/>
               </w:rPr>
-              <w:lastRenderedPageBreak/>
               <w:t>27</w:t>
             </w:r>
             <w:r>
@@ -13558,7 +13652,6 @@
                 <w:cs/>
                 <w:lang w:bidi="ta-IN"/>
               </w:rPr>
-              <w:lastRenderedPageBreak/>
               <w:t>அ</w:t>
             </w:r>
             <w:r>
@@ -13936,7 +14029,6 @@
                 <w:cs/>
                 <w:lang w:bidi="ta-IN"/>
               </w:rPr>
-              <w:lastRenderedPageBreak/>
               <w:t>27</w:t>
             </w:r>
             <w:r>
@@ -16516,6 +16608,30 @@
               </w:rPr>
               <w:t xml:space="preserve"> | </w:t>
             </w:r>
+          </w:p>
+          <w:p>
+            <w:pPr>
+              <w:autoSpaceDE w:val="0"/>
+              <w:autoSpaceDN w:val="0"/>
+              <w:adjustRightInd w:val="0"/>
+              <w:rPr>
+                <w:rFonts w:ascii="Latha" w:hAnsi="Latha" w:cs="Latha"/>
+                <w:szCs w:val="24"/>
+                <w:lang w:bidi="ta-IN"/>
+              </w:rPr>
+            </w:pPr>
+          </w:p>
+          <w:p>
+            <w:pPr>
+              <w:autoSpaceDE w:val="0"/>
+              <w:autoSpaceDN w:val="0"/>
+              <w:adjustRightInd w:val="0"/>
+              <w:rPr>
+                <w:rFonts w:ascii="Latha" w:hAnsi="Latha" w:cs="Latha"/>
+                <w:szCs w:val="24"/>
+                <w:lang w:bidi="ta-IN"/>
+              </w:rPr>
+            </w:pPr>
           </w:p>
           <w:p>
             <w:pPr>
@@ -16560,6 +16676,7 @@
                 <w:cs/>
                 <w:lang w:bidi="ta-IN"/>
               </w:rPr>
+              <w:lastRenderedPageBreak/>
               <w:t>27</w:t>
             </w:r>
             <w:r>
@@ -17629,7 +17746,6 @@
                 <w:cs/>
                 <w:lang w:bidi="ta-IN"/>
               </w:rPr>
-              <w:lastRenderedPageBreak/>
               <w:t>அ</w:t>
             </w:r>
             <w:r>
@@ -17864,7 +17980,6 @@
                 <w:cs/>
                 <w:lang w:bidi="ta-IN"/>
               </w:rPr>
-              <w:lastRenderedPageBreak/>
               <w:t>27</w:t>
             </w:r>
             <w:r>
@@ -18929,7 +19044,6 @@
                 <w:cs/>
                 <w:lang w:bidi="ta-IN"/>
               </w:rPr>
-              <w:lastRenderedPageBreak/>
               <w:t>அ</w:t>
             </w:r>
             <w:r>
@@ -19160,7 +19274,6 @@
                 <w:cs/>
                 <w:lang w:bidi="ta-IN"/>
               </w:rPr>
-              <w:lastRenderedPageBreak/>
               <w:t>9</w:t>
             </w:r>
             <w:r>
@@ -20289,15 +20402,52 @@
                 <w:lang w:bidi="ta-IN"/>
               </w:rPr>
             </w:pPr>
-            <w:r>
-              <w:rPr>
-                <w:rFonts w:cs="Latha"/>
-                <w:b/>
-                <w:bCs/>
-                <w:szCs w:val="28"/>
-                <w:cs/>
-                <w:lang w:bidi="ta-IN"/>
-              </w:rPr>
+          </w:p>
+          <w:p>
+            <w:pPr>
+              <w:autoSpaceDE w:val="0"/>
+              <w:autoSpaceDN w:val="0"/>
+              <w:adjustRightInd w:val="0"/>
+              <w:rPr>
+                <w:rFonts w:ascii="Latha" w:hAnsi="Latha" w:cs="Latha"/>
+                <w:szCs w:val="24"/>
+                <w:lang w:bidi="ta-IN"/>
+              </w:rPr>
+            </w:pPr>
+          </w:p>
+          <w:p>
+            <w:pPr>
+              <w:autoSpaceDE w:val="0"/>
+              <w:autoSpaceDN w:val="0"/>
+              <w:adjustRightInd w:val="0"/>
+              <w:rPr>
+                <w:rFonts w:ascii="Latha" w:hAnsi="Latha" w:cs="Latha"/>
+                <w:szCs w:val="24"/>
+                <w:lang w:bidi="ta-IN"/>
+              </w:rPr>
+            </w:pPr>
+          </w:p>
+          <w:p>
+            <w:pPr>
+              <w:autoSpaceDE w:val="0"/>
+              <w:autoSpaceDN w:val="0"/>
+              <w:adjustRightInd w:val="0"/>
+              <w:rPr>
+                <w:rFonts w:ascii="Latha" w:hAnsi="Latha" w:cs="Latha"/>
+                <w:szCs w:val="24"/>
+                <w:lang w:bidi="ta-IN"/>
+              </w:rPr>
+            </w:pPr>
+            <w:r>
+              <w:rPr>
+                <w:rFonts w:cs="Latha"/>
+                <w:b/>
+                <w:bCs/>
+                <w:szCs w:val="28"/>
+                <w:cs/>
+                <w:lang w:bidi="ta-IN"/>
+              </w:rPr>
+              <w:lastRenderedPageBreak/>
               <w:t>51</w:t>
             </w:r>
             <w:r>
@@ -20919,6 +21069,7 @@
                 <w:cs/>
                 <w:lang w:bidi="ta-IN"/>
               </w:rPr>
+              <w:lastRenderedPageBreak/>
               <w:t>5</w:t>
             </w:r>
             <w:r>
@@ -21444,6 +21595,62 @@
           </w:p>
           <w:p>
             <w:pPr>
+              <w:widowControl w:val="0"/>
+              <w:autoSpaceDE w:val="0"/>
+              <w:autoSpaceDN w:val="0"/>
+              <w:adjustRightInd w:val="0"/>
+              <w:spacing w:before="0" w:line="240" w:lineRule="auto"/>
+              <w:rPr>
+                <w:rFonts w:ascii="Latha" w:hAnsi="Latha" w:cs="Latha"/>
+                <w:szCs w:val="24"/>
+                <w:lang w:bidi="ta-IN"/>
+              </w:rPr>
+            </w:pPr>
+          </w:p>
+          <w:p>
+            <w:pPr>
+              <w:widowControl w:val="0"/>
+              <w:autoSpaceDE w:val="0"/>
+              <w:autoSpaceDN w:val="0"/>
+              <w:adjustRightInd w:val="0"/>
+              <w:spacing w:before="0" w:line="240" w:lineRule="auto"/>
+              <w:rPr>
+                <w:rFonts w:ascii="Latha" w:hAnsi="Latha" w:cs="Latha"/>
+                <w:szCs w:val="24"/>
+                <w:lang w:bidi="ta-IN"/>
+              </w:rPr>
+            </w:pPr>
+          </w:p>
+          <w:p>
+            <w:pPr>
+              <w:widowControl w:val="0"/>
+              <w:autoSpaceDE w:val="0"/>
+              <w:autoSpaceDN w:val="0"/>
+              <w:adjustRightInd w:val="0"/>
+              <w:spacing w:before="0" w:line="240" w:lineRule="auto"/>
+              <w:rPr>
+                <w:rFonts w:ascii="Latha" w:hAnsi="Latha" w:cs="Latha"/>
+                <w:szCs w:val="24"/>
+                <w:lang w:bidi="ta-IN"/>
+              </w:rPr>
+            </w:pPr>
+          </w:p>
+          <w:p>
+            <w:pPr>
+              <w:widowControl w:val="0"/>
+              <w:autoSpaceDE w:val="0"/>
+              <w:autoSpaceDN w:val="0"/>
+              <w:adjustRightInd w:val="0"/>
+              <w:spacing w:before="0" w:line="240" w:lineRule="auto"/>
+              <w:rPr>
+                <w:rFonts w:ascii="Latha" w:hAnsi="Latha" w:cs="Latha"/>
+                <w:szCs w:val="24"/>
+                <w:lang w:bidi="ta-IN"/>
+              </w:rPr>
+            </w:pPr>
+          </w:p>
+          <w:p>
+            <w:pPr>
               <w:autoSpaceDE w:val="0"/>
               <w:autoSpaceDN w:val="0"/>
               <w:adjustRightInd w:val="0"/>
@@ -21460,6 +21667,7 @@
                 <w:sz w:val="32"/>
                 <w:szCs w:val="32"/>
               </w:rPr>
+              <w:lastRenderedPageBreak/>
               <w:t xml:space="preserve"> </w:t>
             </w:r>
             <w:r>
@@ -22125,6 +22333,7 @@
                 <w:cs/>
                 <w:lang w:bidi="ta-IN"/>
               </w:rPr>
+              <w:lastRenderedPageBreak/>
               <w:t>2)</w:t>
             </w:r>
             <w:r>
@@ -24101,7 +24310,6 @@
                 <w:cs/>
                 <w:lang w:bidi="ta-IN"/>
               </w:rPr>
-              <w:lastRenderedPageBreak/>
               <w:t>9</w:t>
             </w:r>
             <w:r>
@@ -26019,6 +26227,7 @@
                 <w:cs/>
                 <w:lang w:bidi="ta-IN"/>
               </w:rPr>
+              <w:lastRenderedPageBreak/>
               <w:t>30</w:t>
             </w:r>
             <w:r>
@@ -26641,6 +26850,7 @@
           <w:szCs w:val="32"/>
           <w:u w:val="single"/>
         </w:rPr>
+        <w:lastRenderedPageBreak/>
         <w:t>====================</w:t>
       </w:r>
     </w:p>

</xml_diff>